<commit_message>
TD05 Q2: run complet sur cluster (dataw_fro03.csv, 135277 lignes) - top5 villes definitif + script run_ventes_full.sh
</commit_message>
<xml_diff>
--- a/COMPTE-RENDU/Rapport_TD02-TD05_Hadoop_Badr.docx
+++ b/COMPTE-RENDU/Rapport_TD02-TD05_Hadoop_Badr.docx
@@ -1748,7 +1748,7 @@
         <w:ind w:left="120"/>
       </w:pPr>
       <w:r>
-        <w:t xml:space="preserve">Pas nécessairement : le mini (1000 lignes) n'est qu'un échantillon ; sur le fichier complet, les totaux par ville sont bien plus élevés et le classement de tête peut changer. La méthode, elle, est strictement identique — même mapper, même reducer, même pipe — ce qui est justement l'intérêt du TD (à relancer sur le cluster pour le TP).</w:t>
+        <w:t xml:space="preserve">NON — vérifié sur le fichier COMPLET (135 277 lignes, 6 255 villes distinctes) via le job MapReduce lancé sur le cluster. Le top 5 devient : LE MANS 3019, CAEN 2056, FLERS 1480, LAVAL 1422, VIRE NORMANDIE 1405. Seuls LE MANS (toujours n° 1) et LAVAL subsistent ; MAMERS, DOMFRONT EN POIRAIE et DOUDEVILLE n'étaient hautes que par hasard d'échantillonnage sur 1000 lignes — remplacées par les vraies grandes villes (CAEN, FLERS, VIRE NORMANDIE). La méthode reste strictement identique (même mapper, même reducer) : seule l'échelle des données change, et cela suffit à rebattre le classement de tête.</w:t>
       </w:r>
     </w:p>
     <w:p>
@@ -1814,7 +1814,7 @@
         <w:spacing w:after="90"/>
       </w:pPr>
       <w:r>
-        <w:t xml:space="preserve">Ces quatre TD rejouent, sur des données et des outils différents, le même invariant : on décrit la donnée (mapper, table externe, rowkey) et un moteur fait le tri et l'agrégation à notre place — et deux chemins indépendants donnent toujours le même résultat. Le TD05 le montre sur un tout autre jeu (ventes par ville) : LE MANS en tête, confirmé par MapReduce ET par SQL. « Rien n'est nouveau : on ne fait que connecter des maillons déjà vus. »</w:t>
+        <w:t xml:space="preserve">Ces quatre TD rejouent, sur des données et des outils différents, le même invariant : on décrit la donnée (mapper, table externe, rowkey) et un moteur fait le tri et l'agrégation à notre place — et deux chemins indépendants donnent toujours le même résultat. Le TD05 le montre sur un tout autre jeu (ventes par ville) : LE MANS en tête sur le fichier complet (3019 articles), confirmé par MapReduce sur le cluster ET par SQL. « Rien n'est nouveau : on ne fait que connecter des maillons déjà vus. »</w:t>
       </w:r>
     </w:p>
     <w:sectPr>

</xml_diff>